<commit_message>
feat(letter): industrialization of Aseptic v4 and GAWEB parity
- chore: centralize GAWEB_FIELDS and serialization logic in gaweb-auditor.logic
- feat: refactor document-engine.worker to be agnostic and rule-injected
- feat: implement progressive step-by-step UX in LetterStation (cascade visibility)
- feat: add Saving Operation (AH) block to LetterPresetEditor
- feat: enforce manual system dialogs (showSaveFilePicker) for JSON and ZIP persistence
- fix: correct batch length constraints and restore missing metadata fields in UI
- docs: annotate official GAWEB v.1 offsets for 100% manual parity
</commit_message>
<xml_diff>
--- a/DOC/NOMBRE.docx
+++ b/DOC/NOMBRE.docx
@@ -162,6 +162,12 @@
     </w:tbl>
     <w:p/>
     <w:sectPr>
+      <w:headerReference w:type="even" r:id="rId7"/>
+      <w:headerReference w:type="default" r:id="rId8"/>
+      <w:footerReference w:type="even" r:id="rId9"/>
+      <w:footerReference w:type="default" r:id="rId10"/>
+      <w:headerReference w:type="first" r:id="rId11"/>
+      <w:footerReference w:type="first" r:id="rId12"/>
       <w:pgSz w:w="11906" w:h="16838"/>
       <w:pgMar w:top="1417" w:right="1701" w:bottom="1417" w:left="1701" w:header="708" w:footer="708" w:gutter="0"/>
       <w:cols w:space="708"/>
@@ -169,6 +175,122 @@
     </w:sectPr>
   </w:body>
 </w:document>
+</file>
+
+<file path=word/endnotes.xml><?xml version="1.0" encoding="utf-8"?>
+<w:endnotes xmlns:wpc="http://schemas.microsoft.com/office/word/2010/wordprocessingCanvas" xmlns:cx="http://schemas.microsoft.com/office/drawing/2014/chartex" xmlns:cx1="http://schemas.microsoft.com/office/drawing/2015/9/8/chartex" xmlns:cx2="http://schemas.microsoft.com/office/drawing/2015/10/21/chartex" xmlns:cx3="http://schemas.microsoft.com/office/drawing/2016/5/9/chartex" xmlns:cx4="http://schemas.microsoft.com/office/drawing/2016/5/10/chartex" xmlns:cx5="http://schemas.microsoft.com/office/drawing/2016/5/11/chartex" xmlns:cx6="http://schemas.microsoft.com/office/drawing/2016/5/12/chartex" xmlns:cx7="http://schemas.microsoft.com/office/drawing/2016/5/13/chartex" xmlns:cx8="http://schemas.microsoft.com/office/drawing/2016/5/14/chartex" xmlns:mc="http://schemas.openxmlformats.org/markup-compatibility/2006" xmlns:aink="http://schemas.microsoft.com/office/drawing/2016/ink" xmlns:am3d="http://schemas.microsoft.com/office/drawing/2017/model3d" xmlns:o="urn:schemas-microsoft-com:office:office" xmlns:oel="http://schemas.microsoft.com/office/2019/extlst" xmlns:r="http://schemas.openxmlformats.org/officeDocument/2006/relationships" xmlns:m="http://schemas.openxmlformats.org/officeDocument/2006/math" xmlns:v="urn:schemas-microsoft-com:vml" xmlns:wp14="http://schemas.microsoft.com/office/word/2010/wordprocessingDrawing" xmlns:wp="http://schemas.openxmlformats.org/drawingml/2006/wordprocessingDrawing" xmlns:w10="urn:schemas-microsoft-com:office:word" xmlns:w="http://schemas.openxmlformats.org/wordprocessingml/2006/main" xmlns:w14="http://schemas.microsoft.com/office/word/2010/wordml" xmlns:w15="http://schemas.microsoft.com/office/word/2012/wordml" xmlns:w16cex="http://schemas.microsoft.com/office/word/2018/wordml/cex" xmlns:w16cid="http://schemas.microsoft.com/office/word/2016/wordml/cid" xmlns:w16="http://schemas.microsoft.com/office/word/2018/wordml" xmlns:w16du="http://schemas.microsoft.com/office/word/2023/wordml/word16du" xmlns:w16sdtdh="http://schemas.microsoft.com/office/word/2020/wordml/sdtdatahash" xmlns:w16sdtfl="http://schemas.microsoft.com/office/word/2024/wordml/sdtformatlock" xmlns:w16se="http://schemas.microsoft.com/office/word/2015/wordml/symex" xmlns:wpg="http://schemas.microsoft.com/office/word/2010/wordprocessingGroup" xmlns:wpi="http://schemas.microsoft.com/office/word/2010/wordprocessingInk" xmlns:wne="http://schemas.microsoft.com/office/word/2006/wordml" xmlns:wps="http://schemas.microsoft.com/office/word/2010/wordprocessingShape" mc:Ignorable="w14 w15 w16se w16cid w16 w16cex w16sdtdh w16sdtfl w16du wp14">
+  <w:endnote w:type="separator" w:id="-1">
+    <w:p>
+      <w:pPr>
+        <w:spacing w:after="0" w:line="240" w:lineRule="auto"/>
+      </w:pPr>
+      <w:r>
+        <w:separator/>
+      </w:r>
+    </w:p>
+  </w:endnote>
+  <w:endnote w:type="continuationSeparator" w:id="0">
+    <w:p>
+      <w:pPr>
+        <w:spacing w:after="0" w:line="240" w:lineRule="auto"/>
+      </w:pPr>
+      <w:r>
+        <w:continuationSeparator/>
+      </w:r>
+    </w:p>
+  </w:endnote>
+</w:endnotes>
+</file>
+
+<file path=word/footer1.xml><?xml version="1.0" encoding="utf-8"?>
+<w:ftr xmlns:wpc="http://schemas.microsoft.com/office/word/2010/wordprocessingCanvas" xmlns:cx="http://schemas.microsoft.com/office/drawing/2014/chartex" xmlns:cx1="http://schemas.microsoft.com/office/drawing/2015/9/8/chartex" xmlns:cx2="http://schemas.microsoft.com/office/drawing/2015/10/21/chartex" xmlns:cx3="http://schemas.microsoft.com/office/drawing/2016/5/9/chartex" xmlns:cx4="http://schemas.microsoft.com/office/drawing/2016/5/10/chartex" xmlns:cx5="http://schemas.microsoft.com/office/drawing/2016/5/11/chartex" xmlns:cx6="http://schemas.microsoft.com/office/drawing/2016/5/12/chartex" xmlns:cx7="http://schemas.microsoft.com/office/drawing/2016/5/13/chartex" xmlns:cx8="http://schemas.microsoft.com/office/drawing/2016/5/14/chartex" xmlns:mc="http://schemas.openxmlformats.org/markup-compatibility/2006" xmlns:aink="http://schemas.microsoft.com/office/drawing/2016/ink" xmlns:am3d="http://schemas.microsoft.com/office/drawing/2017/model3d" xmlns:o="urn:schemas-microsoft-com:office:office" xmlns:oel="http://schemas.microsoft.com/office/2019/extlst" xmlns:r="http://schemas.openxmlformats.org/officeDocument/2006/relationships" xmlns:m="http://schemas.openxmlformats.org/officeDocument/2006/math" xmlns:v="urn:schemas-microsoft-com:vml" xmlns:wp14="http://schemas.microsoft.com/office/word/2010/wordprocessingDrawing" xmlns:wp="http://schemas.openxmlformats.org/drawingml/2006/wordprocessingDrawing" xmlns:w10="urn:schemas-microsoft-com:office:word" xmlns:w="http://schemas.openxmlformats.org/wordprocessingml/2006/main" xmlns:w14="http://schemas.microsoft.com/office/word/2010/wordml" xmlns:w15="http://schemas.microsoft.com/office/word/2012/wordml" xmlns:w16cex="http://schemas.microsoft.com/office/word/2018/wordml/cex" xmlns:w16cid="http://schemas.microsoft.com/office/word/2016/wordml/cid" xmlns:w16="http://schemas.microsoft.com/office/word/2018/wordml" xmlns:w16du="http://schemas.microsoft.com/office/word/2023/wordml/word16du" xmlns:w16sdtdh="http://schemas.microsoft.com/office/word/2020/wordml/sdtdatahash" xmlns:w16sdtfl="http://schemas.microsoft.com/office/word/2024/wordml/sdtformatlock" xmlns:w16se="http://schemas.microsoft.com/office/word/2015/wordml/symex" xmlns:wpg="http://schemas.microsoft.com/office/word/2010/wordprocessingGroup" xmlns:wpi="http://schemas.microsoft.com/office/word/2010/wordprocessingInk" xmlns:wne="http://schemas.microsoft.com/office/word/2006/wordml" xmlns:wps="http://schemas.microsoft.com/office/word/2010/wordprocessingShape" mc:Ignorable="w14 w15 w16se w16cid w16 w16cex w16sdtdh w16sdtfl w16du wp14">
+  <w:p>
+    <w:pPr>
+      <w:pStyle w:val="Piedepgina"/>
+    </w:pPr>
+  </w:p>
+</w:ftr>
+</file>
+
+<file path=word/footer2.xml><?xml version="1.0" encoding="utf-8"?>
+<w:ftr xmlns:wpc="http://schemas.microsoft.com/office/word/2010/wordprocessingCanvas" xmlns:cx="http://schemas.microsoft.com/office/drawing/2014/chartex" xmlns:cx1="http://schemas.microsoft.com/office/drawing/2015/9/8/chartex" xmlns:cx2="http://schemas.microsoft.com/office/drawing/2015/10/21/chartex" xmlns:cx3="http://schemas.microsoft.com/office/drawing/2016/5/9/chartex" xmlns:cx4="http://schemas.microsoft.com/office/drawing/2016/5/10/chartex" xmlns:cx5="http://schemas.microsoft.com/office/drawing/2016/5/11/chartex" xmlns:cx6="http://schemas.microsoft.com/office/drawing/2016/5/12/chartex" xmlns:cx7="http://schemas.microsoft.com/office/drawing/2016/5/13/chartex" xmlns:cx8="http://schemas.microsoft.com/office/drawing/2016/5/14/chartex" xmlns:mc="http://schemas.openxmlformats.org/markup-compatibility/2006" xmlns:aink="http://schemas.microsoft.com/office/drawing/2016/ink" xmlns:am3d="http://schemas.microsoft.com/office/drawing/2017/model3d" xmlns:o="urn:schemas-microsoft-com:office:office" xmlns:oel="http://schemas.microsoft.com/office/2019/extlst" xmlns:r="http://schemas.openxmlformats.org/officeDocument/2006/relationships" xmlns:m="http://schemas.openxmlformats.org/officeDocument/2006/math" xmlns:v="urn:schemas-microsoft-com:vml" xmlns:wp14="http://schemas.microsoft.com/office/word/2010/wordprocessingDrawing" xmlns:wp="http://schemas.openxmlformats.org/drawingml/2006/wordprocessingDrawing" xmlns:w10="urn:schemas-microsoft-com:office:word" xmlns:w="http://schemas.openxmlformats.org/wordprocessingml/2006/main" xmlns:w14="http://schemas.microsoft.com/office/word/2010/wordml" xmlns:w15="http://schemas.microsoft.com/office/word/2012/wordml" xmlns:w16cex="http://schemas.microsoft.com/office/word/2018/wordml/cex" xmlns:w16cid="http://schemas.microsoft.com/office/word/2016/wordml/cid" xmlns:w16="http://schemas.microsoft.com/office/word/2018/wordml" xmlns:w16du="http://schemas.microsoft.com/office/word/2023/wordml/word16du" xmlns:w16sdtdh="http://schemas.microsoft.com/office/word/2020/wordml/sdtdatahash" xmlns:w16sdtfl="http://schemas.microsoft.com/office/word/2024/wordml/sdtformatlock" xmlns:w16se="http://schemas.microsoft.com/office/word/2015/wordml/symex" xmlns:wpg="http://schemas.microsoft.com/office/word/2010/wordprocessingGroup" xmlns:wpi="http://schemas.microsoft.com/office/word/2010/wordprocessingInk" xmlns:wne="http://schemas.microsoft.com/office/word/2006/wordml" xmlns:wps="http://schemas.microsoft.com/office/word/2010/wordprocessingShape" mc:Ignorable="w14 w15 w16se w16cid w16 w16cex w16sdtdh w16sdtfl w16du wp14">
+  <w:p>
+    <w:pPr>
+      <w:pStyle w:val="Piedepgina"/>
+    </w:pPr>
+    <w:r>
+      <w:t>{{PIE}}</w:t>
+    </w:r>
+  </w:p>
+</w:ftr>
+</file>
+
+<file path=word/footer3.xml><?xml version="1.0" encoding="utf-8"?>
+<w:ftr xmlns:wpc="http://schemas.microsoft.com/office/word/2010/wordprocessingCanvas" xmlns:cx="http://schemas.microsoft.com/office/drawing/2014/chartex" xmlns:cx1="http://schemas.microsoft.com/office/drawing/2015/9/8/chartex" xmlns:cx2="http://schemas.microsoft.com/office/drawing/2015/10/21/chartex" xmlns:cx3="http://schemas.microsoft.com/office/drawing/2016/5/9/chartex" xmlns:cx4="http://schemas.microsoft.com/office/drawing/2016/5/10/chartex" xmlns:cx5="http://schemas.microsoft.com/office/drawing/2016/5/11/chartex" xmlns:cx6="http://schemas.microsoft.com/office/drawing/2016/5/12/chartex" xmlns:cx7="http://schemas.microsoft.com/office/drawing/2016/5/13/chartex" xmlns:cx8="http://schemas.microsoft.com/office/drawing/2016/5/14/chartex" xmlns:mc="http://schemas.openxmlformats.org/markup-compatibility/2006" xmlns:aink="http://schemas.microsoft.com/office/drawing/2016/ink" xmlns:am3d="http://schemas.microsoft.com/office/drawing/2017/model3d" xmlns:o="urn:schemas-microsoft-com:office:office" xmlns:oel="http://schemas.microsoft.com/office/2019/extlst" xmlns:r="http://schemas.openxmlformats.org/officeDocument/2006/relationships" xmlns:m="http://schemas.openxmlformats.org/officeDocument/2006/math" xmlns:v="urn:schemas-microsoft-com:vml" xmlns:wp14="http://schemas.microsoft.com/office/word/2010/wordprocessingDrawing" xmlns:wp="http://schemas.openxmlformats.org/drawingml/2006/wordprocessingDrawing" xmlns:w10="urn:schemas-microsoft-com:office:word" xmlns:w="http://schemas.openxmlformats.org/wordprocessingml/2006/main" xmlns:w14="http://schemas.microsoft.com/office/word/2010/wordml" xmlns:w15="http://schemas.microsoft.com/office/word/2012/wordml" xmlns:w16cex="http://schemas.microsoft.com/office/word/2018/wordml/cex" xmlns:w16cid="http://schemas.microsoft.com/office/word/2016/wordml/cid" xmlns:w16="http://schemas.microsoft.com/office/word/2018/wordml" xmlns:w16du="http://schemas.microsoft.com/office/word/2023/wordml/word16du" xmlns:w16sdtdh="http://schemas.microsoft.com/office/word/2020/wordml/sdtdatahash" xmlns:w16sdtfl="http://schemas.microsoft.com/office/word/2024/wordml/sdtformatlock" xmlns:w16se="http://schemas.microsoft.com/office/word/2015/wordml/symex" xmlns:wpg="http://schemas.microsoft.com/office/word/2010/wordprocessingGroup" xmlns:wpi="http://schemas.microsoft.com/office/word/2010/wordprocessingInk" xmlns:wne="http://schemas.microsoft.com/office/word/2006/wordml" xmlns:wps="http://schemas.microsoft.com/office/word/2010/wordprocessingShape" mc:Ignorable="w14 w15 w16se w16cid w16 w16cex w16sdtdh w16sdtfl w16du wp14">
+  <w:p>
+    <w:pPr>
+      <w:pStyle w:val="Piedepgina"/>
+    </w:pPr>
+  </w:p>
+</w:ftr>
+</file>
+
+<file path=word/footnotes.xml><?xml version="1.0" encoding="utf-8"?>
+<w:footnotes xmlns:wpc="http://schemas.microsoft.com/office/word/2010/wordprocessingCanvas" xmlns:cx="http://schemas.microsoft.com/office/drawing/2014/chartex" xmlns:cx1="http://schemas.microsoft.com/office/drawing/2015/9/8/chartex" xmlns:cx2="http://schemas.microsoft.com/office/drawing/2015/10/21/chartex" xmlns:cx3="http://schemas.microsoft.com/office/drawing/2016/5/9/chartex" xmlns:cx4="http://schemas.microsoft.com/office/drawing/2016/5/10/chartex" xmlns:cx5="http://schemas.microsoft.com/office/drawing/2016/5/11/chartex" xmlns:cx6="http://schemas.microsoft.com/office/drawing/2016/5/12/chartex" xmlns:cx7="http://schemas.microsoft.com/office/drawing/2016/5/13/chartex" xmlns:cx8="http://schemas.microsoft.com/office/drawing/2016/5/14/chartex" xmlns:mc="http://schemas.openxmlformats.org/markup-compatibility/2006" xmlns:aink="http://schemas.microsoft.com/office/drawing/2016/ink" xmlns:am3d="http://schemas.microsoft.com/office/drawing/2017/model3d" xmlns:o="urn:schemas-microsoft-com:office:office" xmlns:oel="http://schemas.microsoft.com/office/2019/extlst" xmlns:r="http://schemas.openxmlformats.org/officeDocument/2006/relationships" xmlns:m="http://schemas.openxmlformats.org/officeDocument/2006/math" xmlns:v="urn:schemas-microsoft-com:vml" xmlns:wp14="http://schemas.microsoft.com/office/word/2010/wordprocessingDrawing" xmlns:wp="http://schemas.openxmlformats.org/drawingml/2006/wordprocessingDrawing" xmlns:w10="urn:schemas-microsoft-com:office:word" xmlns:w="http://schemas.openxmlformats.org/wordprocessingml/2006/main" xmlns:w14="http://schemas.microsoft.com/office/word/2010/wordml" xmlns:w15="http://schemas.microsoft.com/office/word/2012/wordml" xmlns:w16cex="http://schemas.microsoft.com/office/word/2018/wordml/cex" xmlns:w16cid="http://schemas.microsoft.com/office/word/2016/wordml/cid" xmlns:w16="http://schemas.microsoft.com/office/word/2018/wordml" xmlns:w16du="http://schemas.microsoft.com/office/word/2023/wordml/word16du" xmlns:w16sdtdh="http://schemas.microsoft.com/office/word/2020/wordml/sdtdatahash" xmlns:w16sdtfl="http://schemas.microsoft.com/office/word/2024/wordml/sdtformatlock" xmlns:w16se="http://schemas.microsoft.com/office/word/2015/wordml/symex" xmlns:wpg="http://schemas.microsoft.com/office/word/2010/wordprocessingGroup" xmlns:wpi="http://schemas.microsoft.com/office/word/2010/wordprocessingInk" xmlns:wne="http://schemas.microsoft.com/office/word/2006/wordml" xmlns:wps="http://schemas.microsoft.com/office/word/2010/wordprocessingShape" mc:Ignorable="w14 w15 w16se w16cid w16 w16cex w16sdtdh w16sdtfl w16du wp14">
+  <w:footnote w:type="separator" w:id="-1">
+    <w:p>
+      <w:pPr>
+        <w:spacing w:after="0" w:line="240" w:lineRule="auto"/>
+      </w:pPr>
+      <w:r>
+        <w:separator/>
+      </w:r>
+    </w:p>
+  </w:footnote>
+  <w:footnote w:type="continuationSeparator" w:id="0">
+    <w:p>
+      <w:pPr>
+        <w:spacing w:after="0" w:line="240" w:lineRule="auto"/>
+      </w:pPr>
+      <w:r>
+        <w:continuationSeparator/>
+      </w:r>
+    </w:p>
+  </w:footnote>
+</w:footnotes>
+</file>
+
+<file path=word/header1.xml><?xml version="1.0" encoding="utf-8"?>
+<w:hdr xmlns:wpc="http://schemas.microsoft.com/office/word/2010/wordprocessingCanvas" xmlns:cx="http://schemas.microsoft.com/office/drawing/2014/chartex" xmlns:cx1="http://schemas.microsoft.com/office/drawing/2015/9/8/chartex" xmlns:cx2="http://schemas.microsoft.com/office/drawing/2015/10/21/chartex" xmlns:cx3="http://schemas.microsoft.com/office/drawing/2016/5/9/chartex" xmlns:cx4="http://schemas.microsoft.com/office/drawing/2016/5/10/chartex" xmlns:cx5="http://schemas.microsoft.com/office/drawing/2016/5/11/chartex" xmlns:cx6="http://schemas.microsoft.com/office/drawing/2016/5/12/chartex" xmlns:cx7="http://schemas.microsoft.com/office/drawing/2016/5/13/chartex" xmlns:cx8="http://schemas.microsoft.com/office/drawing/2016/5/14/chartex" xmlns:mc="http://schemas.openxmlformats.org/markup-compatibility/2006" xmlns:aink="http://schemas.microsoft.com/office/drawing/2016/ink" xmlns:am3d="http://schemas.microsoft.com/office/drawing/2017/model3d" xmlns:o="urn:schemas-microsoft-com:office:office" xmlns:oel="http://schemas.microsoft.com/office/2019/extlst" xmlns:r="http://schemas.openxmlformats.org/officeDocument/2006/relationships" xmlns:m="http://schemas.openxmlformats.org/officeDocument/2006/math" xmlns:v="urn:schemas-microsoft-com:vml" xmlns:wp14="http://schemas.microsoft.com/office/word/2010/wordprocessingDrawing" xmlns:wp="http://schemas.openxmlformats.org/drawingml/2006/wordprocessingDrawing" xmlns:w10="urn:schemas-microsoft-com:office:word" xmlns:w="http://schemas.openxmlformats.org/wordprocessingml/2006/main" xmlns:w14="http://schemas.microsoft.com/office/word/2010/wordml" xmlns:w15="http://schemas.microsoft.com/office/word/2012/wordml" xmlns:w16cex="http://schemas.microsoft.com/office/word/2018/wordml/cex" xmlns:w16cid="http://schemas.microsoft.com/office/word/2016/wordml/cid" xmlns:w16="http://schemas.microsoft.com/office/word/2018/wordml" xmlns:w16du="http://schemas.microsoft.com/office/word/2023/wordml/word16du" xmlns:w16sdtdh="http://schemas.microsoft.com/office/word/2020/wordml/sdtdatahash" xmlns:w16sdtfl="http://schemas.microsoft.com/office/word/2024/wordml/sdtformatlock" xmlns:w16se="http://schemas.microsoft.com/office/word/2015/wordml/symex" xmlns:wpg="http://schemas.microsoft.com/office/word/2010/wordprocessingGroup" xmlns:wpi="http://schemas.microsoft.com/office/word/2010/wordprocessingInk" xmlns:wne="http://schemas.microsoft.com/office/word/2006/wordml" xmlns:wps="http://schemas.microsoft.com/office/word/2010/wordprocessingShape" mc:Ignorable="w14 w15 w16se w16cid w16 w16cex w16sdtdh w16sdtfl w16du wp14">
+  <w:p>
+    <w:pPr>
+      <w:pStyle w:val="Encabezado"/>
+    </w:pPr>
+  </w:p>
+</w:hdr>
+</file>
+
+<file path=word/header2.xml><?xml version="1.0" encoding="utf-8"?>
+<w:hdr xmlns:wpc="http://schemas.microsoft.com/office/word/2010/wordprocessingCanvas" xmlns:cx="http://schemas.microsoft.com/office/drawing/2014/chartex" xmlns:cx1="http://schemas.microsoft.com/office/drawing/2015/9/8/chartex" xmlns:cx2="http://schemas.microsoft.com/office/drawing/2015/10/21/chartex" xmlns:cx3="http://schemas.microsoft.com/office/drawing/2016/5/9/chartex" xmlns:cx4="http://schemas.microsoft.com/office/drawing/2016/5/10/chartex" xmlns:cx5="http://schemas.microsoft.com/office/drawing/2016/5/11/chartex" xmlns:cx6="http://schemas.microsoft.com/office/drawing/2016/5/12/chartex" xmlns:cx7="http://schemas.microsoft.com/office/drawing/2016/5/13/chartex" xmlns:cx8="http://schemas.microsoft.com/office/drawing/2016/5/14/chartex" xmlns:mc="http://schemas.openxmlformats.org/markup-compatibility/2006" xmlns:aink="http://schemas.microsoft.com/office/drawing/2016/ink" xmlns:am3d="http://schemas.microsoft.com/office/drawing/2017/model3d" xmlns:o="urn:schemas-microsoft-com:office:office" xmlns:oel="http://schemas.microsoft.com/office/2019/extlst" xmlns:r="http://schemas.openxmlformats.org/officeDocument/2006/relationships" xmlns:m="http://schemas.openxmlformats.org/officeDocument/2006/math" xmlns:v="urn:schemas-microsoft-com:vml" xmlns:wp14="http://schemas.microsoft.com/office/word/2010/wordprocessingDrawing" xmlns:wp="http://schemas.openxmlformats.org/drawingml/2006/wordprocessingDrawing" xmlns:w10="urn:schemas-microsoft-com:office:word" xmlns:w="http://schemas.openxmlformats.org/wordprocessingml/2006/main" xmlns:w14="http://schemas.microsoft.com/office/word/2010/wordml" xmlns:w15="http://schemas.microsoft.com/office/word/2012/wordml" xmlns:w16cex="http://schemas.microsoft.com/office/word/2018/wordml/cex" xmlns:w16cid="http://schemas.microsoft.com/office/word/2016/wordml/cid" xmlns:w16="http://schemas.microsoft.com/office/word/2018/wordml" xmlns:w16du="http://schemas.microsoft.com/office/word/2023/wordml/word16du" xmlns:w16sdtdh="http://schemas.microsoft.com/office/word/2020/wordml/sdtdatahash" xmlns:w16sdtfl="http://schemas.microsoft.com/office/word/2024/wordml/sdtformatlock" xmlns:w16se="http://schemas.microsoft.com/office/word/2015/wordml/symex" xmlns:wpg="http://schemas.microsoft.com/office/word/2010/wordprocessingGroup" xmlns:wpi="http://schemas.microsoft.com/office/word/2010/wordprocessingInk" xmlns:wne="http://schemas.microsoft.com/office/word/2006/wordml" xmlns:wps="http://schemas.microsoft.com/office/word/2010/wordprocessingShape" mc:Ignorable="w14 w15 w16se w16cid w16 w16cex w16sdtdh w16sdtfl w16du wp14">
+  <w:p>
+    <w:pPr>
+      <w:pStyle w:val="Encabezado"/>
+    </w:pPr>
+    <w:r>
+      <w:t>{{CABECERA}}</w:t>
+    </w:r>
+  </w:p>
+</w:hdr>
+</file>
+
+<file path=word/header3.xml><?xml version="1.0" encoding="utf-8"?>
+<w:hdr xmlns:wpc="http://schemas.microsoft.com/office/word/2010/wordprocessingCanvas" xmlns:cx="http://schemas.microsoft.com/office/drawing/2014/chartex" xmlns:cx1="http://schemas.microsoft.com/office/drawing/2015/9/8/chartex" xmlns:cx2="http://schemas.microsoft.com/office/drawing/2015/10/21/chartex" xmlns:cx3="http://schemas.microsoft.com/office/drawing/2016/5/9/chartex" xmlns:cx4="http://schemas.microsoft.com/office/drawing/2016/5/10/chartex" xmlns:cx5="http://schemas.microsoft.com/office/drawing/2016/5/11/chartex" xmlns:cx6="http://schemas.microsoft.com/office/drawing/2016/5/12/chartex" xmlns:cx7="http://schemas.microsoft.com/office/drawing/2016/5/13/chartex" xmlns:cx8="http://schemas.microsoft.com/office/drawing/2016/5/14/chartex" xmlns:mc="http://schemas.openxmlformats.org/markup-compatibility/2006" xmlns:aink="http://schemas.microsoft.com/office/drawing/2016/ink" xmlns:am3d="http://schemas.microsoft.com/office/drawing/2017/model3d" xmlns:o="urn:schemas-microsoft-com:office:office" xmlns:oel="http://schemas.microsoft.com/office/2019/extlst" xmlns:r="http://schemas.openxmlformats.org/officeDocument/2006/relationships" xmlns:m="http://schemas.openxmlformats.org/officeDocument/2006/math" xmlns:v="urn:schemas-microsoft-com:vml" xmlns:wp14="http://schemas.microsoft.com/office/word/2010/wordprocessingDrawing" xmlns:wp="http://schemas.openxmlformats.org/drawingml/2006/wordprocessingDrawing" xmlns:w10="urn:schemas-microsoft-com:office:word" xmlns:w="http://schemas.openxmlformats.org/wordprocessingml/2006/main" xmlns:w14="http://schemas.microsoft.com/office/word/2010/wordml" xmlns:w15="http://schemas.microsoft.com/office/word/2012/wordml" xmlns:w16cex="http://schemas.microsoft.com/office/word/2018/wordml/cex" xmlns:w16cid="http://schemas.microsoft.com/office/word/2016/wordml/cid" xmlns:w16="http://schemas.microsoft.com/office/word/2018/wordml" xmlns:w16du="http://schemas.microsoft.com/office/word/2023/wordml/word16du" xmlns:w16sdtdh="http://schemas.microsoft.com/office/word/2020/wordml/sdtdatahash" xmlns:w16sdtfl="http://schemas.microsoft.com/office/word/2024/wordml/sdtformatlock" xmlns:w16se="http://schemas.microsoft.com/office/word/2015/wordml/symex" xmlns:wpg="http://schemas.microsoft.com/office/word/2010/wordprocessingGroup" xmlns:wpi="http://schemas.microsoft.com/office/word/2010/wordprocessingInk" xmlns:wne="http://schemas.microsoft.com/office/word/2006/wordml" xmlns:wps="http://schemas.microsoft.com/office/word/2010/wordprocessingShape" mc:Ignorable="w14 w15 w16se w16cid w16 w16cex w16sdtdh w16sdtfl w16du wp14">
+  <w:p>
+    <w:pPr>
+      <w:pStyle w:val="Encabezado"/>
+    </w:pPr>
+  </w:p>
+</w:hdr>
 </file>
 
 <file path=word/numbering.xml><?xml version="1.0" encoding="utf-8"?>
@@ -1245,6 +1367,50 @@
       <w:spacing w:val="5"/>
     </w:rPr>
   </w:style>
+  <w:style w:type="paragraph" w:styleId="Encabezado">
+    <w:name w:val="header"/>
+    <w:basedOn w:val="Normal"/>
+    <w:link w:val="EncabezadoCar"/>
+    <w:uiPriority w:val="99"/>
+    <w:unhideWhenUsed/>
+    <w:rsid w:val="00843A76"/>
+    <w:pPr>
+      <w:tabs>
+        <w:tab w:val="center" w:pos="4252"/>
+        <w:tab w:val="right" w:pos="8504"/>
+      </w:tabs>
+      <w:spacing w:after="0" w:line="240" w:lineRule="auto"/>
+    </w:pPr>
+  </w:style>
+  <w:style w:type="character" w:customStyle="1" w:styleId="EncabezadoCar">
+    <w:name w:val="Encabezado Car"/>
+    <w:basedOn w:val="Fuentedeprrafopredeter"/>
+    <w:link w:val="Encabezado"/>
+    <w:uiPriority w:val="99"/>
+    <w:rsid w:val="00843A76"/>
+  </w:style>
+  <w:style w:type="paragraph" w:styleId="Piedepgina">
+    <w:name w:val="footer"/>
+    <w:basedOn w:val="Normal"/>
+    <w:link w:val="PiedepginaCar"/>
+    <w:uiPriority w:val="99"/>
+    <w:unhideWhenUsed/>
+    <w:rsid w:val="00843A76"/>
+    <w:pPr>
+      <w:tabs>
+        <w:tab w:val="center" w:pos="4252"/>
+        <w:tab w:val="right" w:pos="8504"/>
+      </w:tabs>
+      <w:spacing w:after="0" w:line="240" w:lineRule="auto"/>
+    </w:pPr>
+  </w:style>
+  <w:style w:type="character" w:customStyle="1" w:styleId="PiedepginaCar">
+    <w:name w:val="Pie de página Car"/>
+    <w:basedOn w:val="Fuentedeprrafopredeter"/>
+    <w:link w:val="Piedepgina"/>
+    <w:uiPriority w:val="99"/>
+    <w:rsid w:val="00843A76"/>
+  </w:style>
 </w:styles>
 </file>
 

</xml_diff>

<commit_message>
Industrialization: finalize ETL i18n and fix AuditStation syntax
</commit_message>
<xml_diff>
--- a/DOC/NOMBRE.docx
+++ b/DOC/NOMBRE.docx
@@ -156,18 +156,62 @@
                 <w:highlight w:val="yellow"/>
               </w:rPr>
             </w:pPr>
+            <w:r>
+              <w:rPr>
+                <w:noProof/>
+                <w:sz w:val="36"/>
+                <w:szCs w:val="36"/>
+              </w:rPr>
+              <w:drawing>
+                <wp:inline distT="0" distB="0" distL="0" distR="0" wp14:anchorId="09552B9A" wp14:editId="47B27191">
+                  <wp:extent cx="1724660" cy="1147445"/>
+                  <wp:effectExtent l="0" t="0" r="8890" b="0"/>
+                  <wp:docPr id="2023060501" name="Imagen 1"/>
+                  <wp:cNvGraphicFramePr>
+                    <a:graphicFrameLocks xmlns:a="http://schemas.openxmlformats.org/drawingml/2006/main" noChangeAspect="1"/>
+                  </wp:cNvGraphicFramePr>
+                  <a:graphic xmlns:a="http://schemas.openxmlformats.org/drawingml/2006/main">
+                    <a:graphicData uri="http://schemas.openxmlformats.org/drawingml/2006/picture">
+                      <pic:pic xmlns:pic="http://schemas.openxmlformats.org/drawingml/2006/picture">
+                        <pic:nvPicPr>
+                          <pic:cNvPr id="2023060501" name="Imagen 2023060501"/>
+                          <pic:cNvPicPr/>
+                        </pic:nvPicPr>
+                        <pic:blipFill>
+                          <a:blip r:embed="rId7" cstate="print">
+                            <a:extLst>
+                              <a:ext uri="{28A0092B-C50C-407E-A947-70E740481C1C}">
+                                <a14:useLocalDpi xmlns:a14="http://schemas.microsoft.com/office/drawing/2010/main" val="0"/>
+                              </a:ext>
+                            </a:extLst>
+                          </a:blip>
+                          <a:stretch>
+                            <a:fillRect/>
+                          </a:stretch>
+                        </pic:blipFill>
+                        <pic:spPr>
+                          <a:xfrm>
+                            <a:off x="0" y="0"/>
+                            <a:ext cx="1724660" cy="1147445"/>
+                          </a:xfrm>
+                          <a:prstGeom prst="rect">
+                            <a:avLst/>
+                          </a:prstGeom>
+                        </pic:spPr>
+                      </pic:pic>
+                    </a:graphicData>
+                  </a:graphic>
+                </wp:inline>
+              </w:drawing>
+            </w:r>
           </w:p>
         </w:tc>
       </w:tr>
     </w:tbl>
     <w:p/>
     <w:sectPr>
-      <w:headerReference w:type="even" r:id="rId7"/>
       <w:headerReference w:type="default" r:id="rId8"/>
-      <w:footerReference w:type="even" r:id="rId9"/>
-      <w:footerReference w:type="default" r:id="rId10"/>
-      <w:headerReference w:type="first" r:id="rId11"/>
-      <w:footerReference w:type="first" r:id="rId12"/>
+      <w:footerReference w:type="default" r:id="rId9"/>
       <w:pgSz w:w="11906" w:h="16838"/>
       <w:pgMar w:top="1417" w:right="1701" w:bottom="1417" w:left="1701" w:header="708" w:footer="708" w:gutter="0"/>
       <w:cols w:space="708"/>
@@ -208,29 +252,9 @@
     <w:pPr>
       <w:pStyle w:val="Piedepgina"/>
     </w:pPr>
-  </w:p>
-</w:ftr>
-</file>
-
-<file path=word/footer2.xml><?xml version="1.0" encoding="utf-8"?>
-<w:ftr xmlns:wpc="http://schemas.microsoft.com/office/word/2010/wordprocessingCanvas" xmlns:cx="http://schemas.microsoft.com/office/drawing/2014/chartex" xmlns:cx1="http://schemas.microsoft.com/office/drawing/2015/9/8/chartex" xmlns:cx2="http://schemas.microsoft.com/office/drawing/2015/10/21/chartex" xmlns:cx3="http://schemas.microsoft.com/office/drawing/2016/5/9/chartex" xmlns:cx4="http://schemas.microsoft.com/office/drawing/2016/5/10/chartex" xmlns:cx5="http://schemas.microsoft.com/office/drawing/2016/5/11/chartex" xmlns:cx6="http://schemas.microsoft.com/office/drawing/2016/5/12/chartex" xmlns:cx7="http://schemas.microsoft.com/office/drawing/2016/5/13/chartex" xmlns:cx8="http://schemas.microsoft.com/office/drawing/2016/5/14/chartex" xmlns:mc="http://schemas.openxmlformats.org/markup-compatibility/2006" xmlns:aink="http://schemas.microsoft.com/office/drawing/2016/ink" xmlns:am3d="http://schemas.microsoft.com/office/drawing/2017/model3d" xmlns:o="urn:schemas-microsoft-com:office:office" xmlns:oel="http://schemas.microsoft.com/office/2019/extlst" xmlns:r="http://schemas.openxmlformats.org/officeDocument/2006/relationships" xmlns:m="http://schemas.openxmlformats.org/officeDocument/2006/math" xmlns:v="urn:schemas-microsoft-com:vml" xmlns:wp14="http://schemas.microsoft.com/office/word/2010/wordprocessingDrawing" xmlns:wp="http://schemas.openxmlformats.org/drawingml/2006/wordprocessingDrawing" xmlns:w10="urn:schemas-microsoft-com:office:word" xmlns:w="http://schemas.openxmlformats.org/wordprocessingml/2006/main" xmlns:w14="http://schemas.microsoft.com/office/word/2010/wordml" xmlns:w15="http://schemas.microsoft.com/office/word/2012/wordml" xmlns:w16cex="http://schemas.microsoft.com/office/word/2018/wordml/cex" xmlns:w16cid="http://schemas.microsoft.com/office/word/2016/wordml/cid" xmlns:w16="http://schemas.microsoft.com/office/word/2018/wordml" xmlns:w16du="http://schemas.microsoft.com/office/word/2023/wordml/word16du" xmlns:w16sdtdh="http://schemas.microsoft.com/office/word/2020/wordml/sdtdatahash" xmlns:w16sdtfl="http://schemas.microsoft.com/office/word/2024/wordml/sdtformatlock" xmlns:w16se="http://schemas.microsoft.com/office/word/2015/wordml/symex" xmlns:wpg="http://schemas.microsoft.com/office/word/2010/wordprocessingGroup" xmlns:wpi="http://schemas.microsoft.com/office/word/2010/wordprocessingInk" xmlns:wne="http://schemas.microsoft.com/office/word/2006/wordml" xmlns:wps="http://schemas.microsoft.com/office/word/2010/wordprocessingShape" mc:Ignorable="w14 w15 w16se w16cid w16 w16cex w16sdtdh w16sdtfl w16du wp14">
-  <w:p>
-    <w:pPr>
-      <w:pStyle w:val="Piedepgina"/>
-    </w:pPr>
     <w:r>
       <w:t>{{PIE}}</w:t>
     </w:r>
-  </w:p>
-</w:ftr>
-</file>
-
-<file path=word/footer3.xml><?xml version="1.0" encoding="utf-8"?>
-<w:ftr xmlns:wpc="http://schemas.microsoft.com/office/word/2010/wordprocessingCanvas" xmlns:cx="http://schemas.microsoft.com/office/drawing/2014/chartex" xmlns:cx1="http://schemas.microsoft.com/office/drawing/2015/9/8/chartex" xmlns:cx2="http://schemas.microsoft.com/office/drawing/2015/10/21/chartex" xmlns:cx3="http://schemas.microsoft.com/office/drawing/2016/5/9/chartex" xmlns:cx4="http://schemas.microsoft.com/office/drawing/2016/5/10/chartex" xmlns:cx5="http://schemas.microsoft.com/office/drawing/2016/5/11/chartex" xmlns:cx6="http://schemas.microsoft.com/office/drawing/2016/5/12/chartex" xmlns:cx7="http://schemas.microsoft.com/office/drawing/2016/5/13/chartex" xmlns:cx8="http://schemas.microsoft.com/office/drawing/2016/5/14/chartex" xmlns:mc="http://schemas.openxmlformats.org/markup-compatibility/2006" xmlns:aink="http://schemas.microsoft.com/office/drawing/2016/ink" xmlns:am3d="http://schemas.microsoft.com/office/drawing/2017/model3d" xmlns:o="urn:schemas-microsoft-com:office:office" xmlns:oel="http://schemas.microsoft.com/office/2019/extlst" xmlns:r="http://schemas.openxmlformats.org/officeDocument/2006/relationships" xmlns:m="http://schemas.openxmlformats.org/officeDocument/2006/math" xmlns:v="urn:schemas-microsoft-com:vml" xmlns:wp14="http://schemas.microsoft.com/office/word/2010/wordprocessingDrawing" xmlns:wp="http://schemas.openxmlformats.org/drawingml/2006/wordprocessingDrawing" xmlns:w10="urn:schemas-microsoft-com:office:word" xmlns:w="http://schemas.openxmlformats.org/wordprocessingml/2006/main" xmlns:w14="http://schemas.microsoft.com/office/word/2010/wordml" xmlns:w15="http://schemas.microsoft.com/office/word/2012/wordml" xmlns:w16cex="http://schemas.microsoft.com/office/word/2018/wordml/cex" xmlns:w16cid="http://schemas.microsoft.com/office/word/2016/wordml/cid" xmlns:w16="http://schemas.microsoft.com/office/word/2018/wordml" xmlns:w16du="http://schemas.microsoft.com/office/word/2023/wordml/word16du" xmlns:w16sdtdh="http://schemas.microsoft.com/office/word/2020/wordml/sdtdatahash" xmlns:w16sdtfl="http://schemas.microsoft.com/office/word/2024/wordml/sdtformatlock" xmlns:w16se="http://schemas.microsoft.com/office/word/2015/wordml/symex" xmlns:wpg="http://schemas.microsoft.com/office/word/2010/wordprocessingGroup" xmlns:wpi="http://schemas.microsoft.com/office/word/2010/wordprocessingInk" xmlns:wne="http://schemas.microsoft.com/office/word/2006/wordml" xmlns:wps="http://schemas.microsoft.com/office/word/2010/wordprocessingShape" mc:Ignorable="w14 w15 w16se w16cid w16 w16cex w16sdtdh w16sdtfl w16du wp14">
-  <w:p>
-    <w:pPr>
-      <w:pStyle w:val="Piedepgina"/>
-    </w:pPr>
   </w:p>
 </w:ftr>
 </file>
@@ -262,29 +286,57 @@
 
 <file path=word/header1.xml><?xml version="1.0" encoding="utf-8"?>
 <w:hdr xmlns:wpc="http://schemas.microsoft.com/office/word/2010/wordprocessingCanvas" xmlns:cx="http://schemas.microsoft.com/office/drawing/2014/chartex" xmlns:cx1="http://schemas.microsoft.com/office/drawing/2015/9/8/chartex" xmlns:cx2="http://schemas.microsoft.com/office/drawing/2015/10/21/chartex" xmlns:cx3="http://schemas.microsoft.com/office/drawing/2016/5/9/chartex" xmlns:cx4="http://schemas.microsoft.com/office/drawing/2016/5/10/chartex" xmlns:cx5="http://schemas.microsoft.com/office/drawing/2016/5/11/chartex" xmlns:cx6="http://schemas.microsoft.com/office/drawing/2016/5/12/chartex" xmlns:cx7="http://schemas.microsoft.com/office/drawing/2016/5/13/chartex" xmlns:cx8="http://schemas.microsoft.com/office/drawing/2016/5/14/chartex" xmlns:mc="http://schemas.openxmlformats.org/markup-compatibility/2006" xmlns:aink="http://schemas.microsoft.com/office/drawing/2016/ink" xmlns:am3d="http://schemas.microsoft.com/office/drawing/2017/model3d" xmlns:o="urn:schemas-microsoft-com:office:office" xmlns:oel="http://schemas.microsoft.com/office/2019/extlst" xmlns:r="http://schemas.openxmlformats.org/officeDocument/2006/relationships" xmlns:m="http://schemas.openxmlformats.org/officeDocument/2006/math" xmlns:v="urn:schemas-microsoft-com:vml" xmlns:wp14="http://schemas.microsoft.com/office/word/2010/wordprocessingDrawing" xmlns:wp="http://schemas.openxmlformats.org/drawingml/2006/wordprocessingDrawing" xmlns:w10="urn:schemas-microsoft-com:office:word" xmlns:w="http://schemas.openxmlformats.org/wordprocessingml/2006/main" xmlns:w14="http://schemas.microsoft.com/office/word/2010/wordml" xmlns:w15="http://schemas.microsoft.com/office/word/2012/wordml" xmlns:w16cex="http://schemas.microsoft.com/office/word/2018/wordml/cex" xmlns:w16cid="http://schemas.microsoft.com/office/word/2016/wordml/cid" xmlns:w16="http://schemas.microsoft.com/office/word/2018/wordml" xmlns:w16du="http://schemas.microsoft.com/office/word/2023/wordml/word16du" xmlns:w16sdtdh="http://schemas.microsoft.com/office/word/2020/wordml/sdtdatahash" xmlns:w16sdtfl="http://schemas.microsoft.com/office/word/2024/wordml/sdtformatlock" xmlns:w16se="http://schemas.microsoft.com/office/word/2015/wordml/symex" xmlns:wpg="http://schemas.microsoft.com/office/word/2010/wordprocessingGroup" xmlns:wpi="http://schemas.microsoft.com/office/word/2010/wordprocessingInk" xmlns:wne="http://schemas.microsoft.com/office/word/2006/wordml" xmlns:wps="http://schemas.microsoft.com/office/word/2010/wordprocessingShape" mc:Ignorable="w14 w15 w16se w16cid w16 w16cex w16sdtdh w16sdtfl w16du wp14">
-  <w:p>
-    <w:pPr>
-      <w:pStyle w:val="Encabezado"/>
-    </w:pPr>
-  </w:p>
-</w:hdr>
-</file>
-
-<file path=word/header2.xml><?xml version="1.0" encoding="utf-8"?>
-<w:hdr xmlns:wpc="http://schemas.microsoft.com/office/word/2010/wordprocessingCanvas" xmlns:cx="http://schemas.microsoft.com/office/drawing/2014/chartex" xmlns:cx1="http://schemas.microsoft.com/office/drawing/2015/9/8/chartex" xmlns:cx2="http://schemas.microsoft.com/office/drawing/2015/10/21/chartex" xmlns:cx3="http://schemas.microsoft.com/office/drawing/2016/5/9/chartex" xmlns:cx4="http://schemas.microsoft.com/office/drawing/2016/5/10/chartex" xmlns:cx5="http://schemas.microsoft.com/office/drawing/2016/5/11/chartex" xmlns:cx6="http://schemas.microsoft.com/office/drawing/2016/5/12/chartex" xmlns:cx7="http://schemas.microsoft.com/office/drawing/2016/5/13/chartex" xmlns:cx8="http://schemas.microsoft.com/office/drawing/2016/5/14/chartex" xmlns:mc="http://schemas.openxmlformats.org/markup-compatibility/2006" xmlns:aink="http://schemas.microsoft.com/office/drawing/2016/ink" xmlns:am3d="http://schemas.microsoft.com/office/drawing/2017/model3d" xmlns:o="urn:schemas-microsoft-com:office:office" xmlns:oel="http://schemas.microsoft.com/office/2019/extlst" xmlns:r="http://schemas.openxmlformats.org/officeDocument/2006/relationships" xmlns:m="http://schemas.openxmlformats.org/officeDocument/2006/math" xmlns:v="urn:schemas-microsoft-com:vml" xmlns:wp14="http://schemas.microsoft.com/office/word/2010/wordprocessingDrawing" xmlns:wp="http://schemas.openxmlformats.org/drawingml/2006/wordprocessingDrawing" xmlns:w10="urn:schemas-microsoft-com:office:word" xmlns:w="http://schemas.openxmlformats.org/wordprocessingml/2006/main" xmlns:w14="http://schemas.microsoft.com/office/word/2010/wordml" xmlns:w15="http://schemas.microsoft.com/office/word/2012/wordml" xmlns:w16cex="http://schemas.microsoft.com/office/word/2018/wordml/cex" xmlns:w16cid="http://schemas.microsoft.com/office/word/2016/wordml/cid" xmlns:w16="http://schemas.microsoft.com/office/word/2018/wordml" xmlns:w16du="http://schemas.microsoft.com/office/word/2023/wordml/word16du" xmlns:w16sdtdh="http://schemas.microsoft.com/office/word/2020/wordml/sdtdatahash" xmlns:w16sdtfl="http://schemas.microsoft.com/office/word/2024/wordml/sdtformatlock" xmlns:w16se="http://schemas.microsoft.com/office/word/2015/wordml/symex" xmlns:wpg="http://schemas.microsoft.com/office/word/2010/wordprocessingGroup" xmlns:wpi="http://schemas.microsoft.com/office/word/2010/wordprocessingInk" xmlns:wne="http://schemas.microsoft.com/office/word/2006/wordml" xmlns:wps="http://schemas.microsoft.com/office/word/2010/wordprocessingShape" mc:Ignorable="w14 w15 w16se w16cid w16 w16cex w16sdtdh w16sdtfl w16du wp14">
-  <w:p>
-    <w:pPr>
-      <w:pStyle w:val="Encabezado"/>
-    </w:pPr>
-    <w:r>
-      <w:t>{{CABECERA}}</w:t>
-    </w:r>
-  </w:p>
-</w:hdr>
-</file>
-
-<file path=word/header3.xml><?xml version="1.0" encoding="utf-8"?>
-<w:hdr xmlns:wpc="http://schemas.microsoft.com/office/word/2010/wordprocessingCanvas" xmlns:cx="http://schemas.microsoft.com/office/drawing/2014/chartex" xmlns:cx1="http://schemas.microsoft.com/office/drawing/2015/9/8/chartex" xmlns:cx2="http://schemas.microsoft.com/office/drawing/2015/10/21/chartex" xmlns:cx3="http://schemas.microsoft.com/office/drawing/2016/5/9/chartex" xmlns:cx4="http://schemas.microsoft.com/office/drawing/2016/5/10/chartex" xmlns:cx5="http://schemas.microsoft.com/office/drawing/2016/5/11/chartex" xmlns:cx6="http://schemas.microsoft.com/office/drawing/2016/5/12/chartex" xmlns:cx7="http://schemas.microsoft.com/office/drawing/2016/5/13/chartex" xmlns:cx8="http://schemas.microsoft.com/office/drawing/2016/5/14/chartex" xmlns:mc="http://schemas.openxmlformats.org/markup-compatibility/2006" xmlns:aink="http://schemas.microsoft.com/office/drawing/2016/ink" xmlns:am3d="http://schemas.microsoft.com/office/drawing/2017/model3d" xmlns:o="urn:schemas-microsoft-com:office:office" xmlns:oel="http://schemas.microsoft.com/office/2019/extlst" xmlns:r="http://schemas.openxmlformats.org/officeDocument/2006/relationships" xmlns:m="http://schemas.openxmlformats.org/officeDocument/2006/math" xmlns:v="urn:schemas-microsoft-com:vml" xmlns:wp14="http://schemas.microsoft.com/office/word/2010/wordprocessingDrawing" xmlns:wp="http://schemas.openxmlformats.org/drawingml/2006/wordprocessingDrawing" xmlns:w10="urn:schemas-microsoft-com:office:word" xmlns:w="http://schemas.openxmlformats.org/wordprocessingml/2006/main" xmlns:w14="http://schemas.microsoft.com/office/word/2010/wordml" xmlns:w15="http://schemas.microsoft.com/office/word/2012/wordml" xmlns:w16cex="http://schemas.microsoft.com/office/word/2018/wordml/cex" xmlns:w16cid="http://schemas.microsoft.com/office/word/2016/wordml/cid" xmlns:w16="http://schemas.microsoft.com/office/word/2018/wordml" xmlns:w16du="http://schemas.microsoft.com/office/word/2023/wordml/word16du" xmlns:w16sdtdh="http://schemas.microsoft.com/office/word/2020/wordml/sdtdatahash" xmlns:w16sdtfl="http://schemas.microsoft.com/office/word/2024/wordml/sdtformatlock" xmlns:w16se="http://schemas.microsoft.com/office/word/2015/wordml/symex" xmlns:wpg="http://schemas.microsoft.com/office/word/2010/wordprocessingGroup" xmlns:wpi="http://schemas.microsoft.com/office/word/2010/wordprocessingInk" xmlns:wne="http://schemas.microsoft.com/office/word/2006/wordml" xmlns:wps="http://schemas.microsoft.com/office/word/2010/wordprocessingShape" mc:Ignorable="w14 w15 w16se w16cid w16 w16cex w16sdtdh w16sdtfl w16du wp14">
+  <w:tbl>
+    <w:tblPr>
+      <w:tblStyle w:val="Tablaconcuadrcula"/>
+      <w:tblW w:w="0" w:type="auto"/>
+      <w:tblBorders>
+        <w:top w:val="none" w:sz="0" w:space="0" w:color="auto"/>
+        <w:left w:val="none" w:sz="0" w:space="0" w:color="auto"/>
+        <w:bottom w:val="none" w:sz="0" w:space="0" w:color="auto"/>
+        <w:right w:val="none" w:sz="0" w:space="0" w:color="auto"/>
+        <w:insideH w:val="single" w:sz="4" w:space="0" w:color="FFFFFF" w:themeColor="background1"/>
+        <w:insideV w:val="single" w:sz="4" w:space="0" w:color="FFFFFF" w:themeColor="background1"/>
+      </w:tblBorders>
+      <w:shd w:val="clear" w:color="auto" w:fill="215E99" w:themeFill="text2" w:themeFillTint="BF"/>
+      <w:tblLook w:val="04A0" w:firstRow="1" w:lastRow="0" w:firstColumn="1" w:lastColumn="0" w:noHBand="0" w:noVBand="1"/>
+    </w:tblPr>
+    <w:tblGrid>
+      <w:gridCol w:w="4247"/>
+      <w:gridCol w:w="4247"/>
+    </w:tblGrid>
+    <w:tr>
+      <w:tc>
+        <w:tcPr>
+          <w:tcW w:w="4247" w:type="dxa"/>
+          <w:shd w:val="clear" w:color="auto" w:fill="215E99" w:themeFill="text2" w:themeFillTint="BF"/>
+        </w:tcPr>
+        <w:p>
+          <w:pPr>
+            <w:pStyle w:val="Encabezado"/>
+          </w:pPr>
+          <w:r>
+            <w:rPr>
+              <w:rFonts w:ascii="Algerian" w:hAnsi="Algerian"/>
+              <w:color w:val="FFFFFF" w:themeColor="background1"/>
+            </w:rPr>
+            <w:t>{{CABECERA}}</w:t>
+          </w:r>
+        </w:p>
+      </w:tc>
+      <w:tc>
+        <w:tcPr>
+          <w:tcW w:w="4247" w:type="dxa"/>
+          <w:shd w:val="clear" w:color="auto" w:fill="215E99" w:themeFill="text2" w:themeFillTint="BF"/>
+        </w:tcPr>
+        <w:p>
+          <w:pPr>
+            <w:pStyle w:val="Encabezado"/>
+          </w:pPr>
+        </w:p>
+      </w:tc>
+    </w:tr>
+  </w:tbl>
   <w:p>
     <w:pPr>
       <w:pStyle w:val="Encabezado"/>
@@ -1411,6 +1463,25 @@
     <w:uiPriority w:val="99"/>
     <w:rsid w:val="00843A76"/>
   </w:style>
+  <w:style w:type="table" w:styleId="Tablaconcuadrcula">
+    <w:name w:val="Table Grid"/>
+    <w:basedOn w:val="Tablanormal"/>
+    <w:uiPriority w:val="39"/>
+    <w:rsid w:val="007B730C"/>
+    <w:pPr>
+      <w:spacing w:after="0" w:line="240" w:lineRule="auto"/>
+    </w:pPr>
+    <w:tblPr>
+      <w:tblBorders>
+        <w:top w:val="single" w:sz="4" w:space="0" w:color="auto"/>
+        <w:left w:val="single" w:sz="4" w:space="0" w:color="auto"/>
+        <w:bottom w:val="single" w:sz="4" w:space="0" w:color="auto"/>
+        <w:right w:val="single" w:sz="4" w:space="0" w:color="auto"/>
+        <w:insideH w:val="single" w:sz="4" w:space="0" w:color="auto"/>
+        <w:insideV w:val="single" w:sz="4" w:space="0" w:color="auto"/>
+      </w:tblBorders>
+    </w:tblPr>
+  </w:style>
 </w:styles>
 </file>
 

</xml_diff>